<commit_message>
Grinzi in placa (GP): recunoastere, reazeme pe centuri/grinzi/stalpi, etrieri la 15 pe toata lungimea, 3fi14 sus si jos, verificari; sectiuni cu acoperirea placii (etrier h-3 cm) si eticheta 3+3fi14; README si documentatia Word
Co-Authored-By: Claude Opus 5.5 <noreply@anthropic.com>
Claude-Session: https://claude.ai/code/session_017XWGazZ3UpbdU62RkBToYo
</commit_message>
<xml_diff>
--- a/Instructiuni de folosire lisp Generare Grinzi Buiandrugi, sectiuni si renumerotare.docx
+++ b/Instructiuni de folosire lisp Generare Grinzi Buiandrugi, sectiuni si renumerotare.docx
@@ -601,7 +601,7 @@
         <w:spacing w:after="120" w:line="276"/>
       </w:pPr>
       <w:r>
-        <w:t xml:space="preserve">Comanda citeste planul de cofraj si desfasoara toate grinzile (G..) si toti buiandrugii (B..) de pe el, intr-un singur rand, toate cu fata de sus la acelasi nivel. Pentru fiecare element deseneaza: conturul si carcasa, reazemele, etrierii, cotele, axele, cotele de nivel, sectiunea </w:t>
+        <w:t xml:space="preserve">Comanda citeste planul de cofraj si desfasoara toate grinzile (G..), grinzile in placa (GP..) si toti buiandrugii (B..) de pe el, intr-un singur rand, toate cu fata de sus la acelasi nivel. Pentru fiecare element deseneaza: conturul si carcasa, reazemele, etrierii, cotele, axele, cotele de nivel, sectiunea </w:t>
       </w:r>
       <w:r>
         <w:rPr>
@@ -1670,7 +1670,7 @@
         <w:spacing w:after="60" w:line="276"/>
       </w:pPr>
       <w:r>
-        <w:t xml:space="preserve">Dati coltul stanga-sus al primei desfasurate (fata de sus a elementelor). Se pun intai grinzile (G1, G2, ...), apoi buiandrugii (B1, B2, ...), apoi detaliile centurilor.</w:t>
+        <w:t>Dati coltul stanga-sus al primei desfasurate (fata de sus a elementelor). Se pun intai grinzile (G1, G2, ...), apoi grinzile in placa (GP5, ...), apoi buiandrugii (B1, B2, ...), apoi detaliile centurilor.</w:t>
       </w:r>
     </w:p>
     <w:p>
@@ -2412,6 +2412,82 @@
     <w:p>
       <w:pPr>
         <w:keepNext/>
+        <w:spacing w:after="100" w:before="220"/>
+      </w:pPr>
+      <w:r>
+        <w:rPr>
+          <w:b/>
+          <w:bCs/>
+          <w:color w:val="2E5597"/>
+          <w:sz w:val="22"/>
+          <w:szCs w:val="22"/>
+        </w:rPr>
+        <w:t>Grinzi in placa (GP)</w:t>
+      </w:r>
+    </w:p>
+    <w:p>
+      <w:pPr>
+        <w:spacing w:after="120" w:line="276"/>
+      </w:pPr>
+      <w:r>
+        <w:t>Un text ca GP5 25x15 (pe Markers, intre doua linii pe Grinzi) e o grinda in placa: inalta cat placa, cu fata de sus la nivelul placii. Numarul ei vine dupa al grinzilor G (G1...G4, apoi GP5). Desfasurata se face ca la grinzi, cu diferentele:</w:t>
+      </w:r>
+    </w:p>
+    <w:p>
+      <w:pPr>
+        <w:pStyle w:val="ListParagraph"/>
+        <w:numPr>
+          <w:ilvl w:val="0"/>
+          <w:numId w:val="2"/>
+        </w:numPr>
+        <w:spacing w:after="60" w:line="276"/>
+      </w:pPr>
+      <w:r>
+        <w:t>reazemele sunt centurile (fasiile de pe Centuri), grinzile si stalpii pe care ii traverseaza sau in care se termina; se deseneaza ca un dreptunghi hasurat ANSI31 de 10 cm sub ea, iar lantul de jos are reazemele si deschiderile dintre ele;</w:t>
+      </w:r>
+    </w:p>
+    <w:p>
+      <w:pPr>
+        <w:pStyle w:val="ListParagraph"/>
+        <w:numPr>
+          <w:ilvl w:val="0"/>
+          <w:numId w:val="2"/>
+        </w:numPr>
+        <w:spacing w:after="60" w:line="276"/>
+      </w:pPr>
+      <w:r>
+        <w:t>etrierii sunt la 15 cm de la un capat la altul, si peste reazeme; ce ramane din impartire se imparte egal la cele doua capete; lantul de sus e o singura cota, cu etr. %%C8/15;</w:t>
+      </w:r>
+    </w:p>
+    <w:p>
+      <w:pPr>
+        <w:pStyle w:val="ListParagraph"/>
+        <w:numPr>
+          <w:ilvl w:val="0"/>
+          <w:numId w:val="2"/>
+        </w:numPr>
+        <w:spacing w:after="60" w:line="276"/>
+      </w:pPr>
+      <w:r>
+        <w:t>armatura: 3%%C14 sus si jos, ciocuri pe inaltimea carcasei (10 cm la placa de 15);</w:t>
+      </w:r>
+    </w:p>
+    <w:p>
+      <w:pPr>
+        <w:pStyle w:val="ListParagraph"/>
+        <w:numPr>
+          <w:ilvl w:val="0"/>
+          <w:numId w:val="2"/>
+        </w:numPr>
+        <w:spacing w:after="60" w:line="276"/>
+      </w:pPr>
+      <w:r>
+        <w:t>axele, sectiunea xx, cotele de nivel (la dreapta), chenarele si titlul - ca la celelalte grinzi.</w:t>
+      </w:r>
+    </w:p>
+    <w:p>
+      <w:pPr>
+        <w:keepNext/>
         <w:spacing w:after="160" w:before="360"/>
       </w:pPr>
       <w:r>
@@ -2715,6 +2791,32 @@
       </w:pPr>
       <w:r>
         <w:t xml:space="preserve">acelasi nume la elemente cu lungimi sau reazeme diferite (se face cate o desfasurata pentru fiecare).</w:t>
+      </w:r>
+    </w:p>
+    <w:p>
+      <w:pPr>
+        <w:pStyle w:val="ListParagraph"/>
+        <w:numPr>
+          <w:ilvl w:val="0"/>
+          <w:numId w:val="2"/>
+        </w:numPr>
+        <w:spacing w:after="60" w:line="276"/>
+      </w:pPr>
+      <w:r>
+        <w:t>grinda in placa (GP) cu inaltimea diferita de grosimea placii, sau numerotata inaintea grinzilor G;</w:t>
+      </w:r>
+    </w:p>
+    <w:p>
+      <w:pPr>
+        <w:pStyle w:val="ListParagraph"/>
+        <w:numPr>
+          <w:ilvl w:val="0"/>
+          <w:numId w:val="2"/>
+        </w:numPr>
+        <w:spacing w:after="60" w:line="276"/>
+      </w:pPr>
+      <w:r>
+        <w:t>capat de grinda in placa care nu reazema pe centura, grinda sau stalp.</w:t>
       </w:r>
     </w:p>
     <w:p>
@@ -5100,6 +5202,19 @@
     </w:p>
     <w:p>
       <w:pPr>
+        <w:pStyle w:val="ListParagraph"/>
+        <w:numPr>
+          <w:ilvl w:val="0"/>
+          <w:numId w:val="2"/>
+        </w:numPr>
+        <w:spacing w:after="60" w:line="276"/>
+      </w:pPr>
+      <w:r>
+        <w:t>la o grinda in placa (GP): conturul e un dreptunghi, fara placa; etrierul are sus si jos acoperirea placii (1.5 cm), la lateral 2.5 cm; o singura eticheta pentru toate barele, de exemplu 3+3%%C14.</w:t>
+      </w:r>
+    </w:p>
+    <w:p>
+      <w:pPr>
         <w:spacing w:after="120" w:line="276"/>
       </w:pPr>
       <w:r>
@@ -5121,7 +5236,7 @@
         <w:spacing w:after="120" w:line="276"/>
       </w:pPr>
       <w:r>
-        <w:t xml:space="preserve">Sub sectiune, etrierul desfasurat: laturi = sectiunea - 5 cm, colturi rotunjite, ciocuri de 10 cm, cotele, marca </w:t>
+        <w:t xml:space="preserve">Sub sectiune, etrierul desfasurat: laturi = sectiunea - 5 cm (la grinzile in placa: latimea - 5 cm si inaltimea - 3 cm), colturi rotunjite, ciocuri de 10 cm, cotele, marca </w:t>
       </w:r>
       <w:r>
         <w:rPr>

</xml_diff>

<commit_message>
Grupul de cofraj cu ambele cote ca text simplu se accepta (cea mai mica tine loc de field); sectiunile identice se compara si dupa cote de nivel si placa (grosime, parti, sus/jos)
Co-Authored-By: Claude Opus 5.5 <noreply@anthropic.com>
Claude-Session: https://claude.ai/code/session_017XWGazZ3UpbdU62RkBToYo
</commit_message>
<xml_diff>
--- a/Instructiuni de folosire lisp Generare Grinzi Buiandrugi, sectiuni si renumerotare.docx
+++ b/Instructiuni de folosire lisp Generare Grinzi Buiandrugi, sectiuni si renumerotare.docx
@@ -1488,7 +1488,7 @@
         <w:spacing w:after="120" w:line="276"/>
       </w:pPr>
       <w:r>
-        <w:t xml:space="preserve">O sectiune de cofraj apartine elementului care are aceleasi doua fete ca ea si e cel mai aproape de ea, pe lungimea lui. Din grup se iau cotele de inaltime (de exemplu 14 + 11), textul liber (cota de sus) si textul cu field (cota de jos).</w:t>
+        <w:t>O sectiune de cofraj apartine elementului care are aceleasi doua fete ca ea si e cel mai aproape de ea, pe lungimea lui. Din grup se iau cotele de inaltime (de exemplu 14 + 11), textul liber (cota de sus) si textul cu field (cota de jos). Daca ambele cote sunt text simplu (fara field), cea mai mica tine loc de field si se verifica la fel.</w:t>
       </w:r>
     </w:p>
     <w:p>
@@ -5478,7 +5478,7 @@
         <w:spacing w:after="60" w:line="276"/>
       </w:pPr>
       <w:r>
-        <w:t xml:space="preserve">sectiuni cu numere diferite care au aceeasi forma, dimensiuni, bare si etrieri (placa si cota nu conteaza) - de exemplu </w:t>
+        <w:t xml:space="preserve">sectiuni cu numere diferite care au aceeasi forma, dimensiuni, cote de nivel, placa (grosime, una sau doua parti, sus sau jos), bare si etrieri - placa in stanga sau in dreapta e aceeasi sectiune, intoarsa - de exemplu </w:t>
       </w:r>
       <w:r>
         <w:rPr>

</xml_diff>

<commit_message>
Nume cu text dupa dimensiuni (ex. G5 30x40 (intoarsa)); barele centurilor calculate: conturul exterior + o linie la zidurile interioare, x nr. bare / 12, rotunjit in sus, x 1.25
Co-Authored-By: Claude Opus 5.5 <noreply@anthropic.com>
Claude-Session: https://claude.ai/code/session_017XWGazZ3UpbdU62RkBToYo
</commit_message>
<xml_diff>
--- a/Instructiuni de folosire lisp Generare Grinzi Buiandrugi, sectiuni si renumerotare.docx
+++ b/Instructiuni de folosire lisp Generare Grinzi Buiandrugi, sectiuni si renumerotare.docx
@@ -1416,7 +1416,7 @@
         <w:t xml:space="preserve">Grinzi</w:t>
       </w:r>
       <w:r>
-        <w:t xml:space="preserve">, cu numele intre ele. Liniile se pot opri la fata stalpului sau pot intra peste stalp.</w:t>
+        <w:t>, cu numele intre ele. Dupa dimensiuni poate urma, dupa un spatiu, un text pentru santier, de exemplu G5 30x40 (intoarsa): ramane in nume si in titlul desfasuratei. Liniile se pot opri la fata stalpului sau pot intra peste stalp.</w:t>
       </w:r>
     </w:p>
     <w:p>
@@ -2506,52 +2506,40 @@
         <w:spacing w:after="120" w:line="276"/>
       </w:pPr>
       <w:r>
-        <w:t xml:space="preserve">La sfarsitul randului, cate un detaliu pentru fiecare tip de centura de pe plan (dupa numele C..): sectiunea la 1:20 (cu placa din grupul de cofraj al centurii), barele, etrierul in sectiune, cotele de nivel, etrierul desfasurat (laturi = centura - 5 cm, </w:t>
-      </w:r>
-      <w:r>
-        <w:rPr>
-          <w:rFonts w:ascii="Consolas" w:cs="Consolas" w:eastAsia="Consolas" w:hAnsi="Consolas"/>
-          <w:sz w:val="19"/>
-          <w:szCs w:val="19"/>
-        </w:rPr>
-        <w:t xml:space="preserve">etr %%C8/15</w:t>
-      </w:r>
-      <w:r>
-        <w:t xml:space="preserve">, L= field) cu numarul de bucati, si dedesubt grupul barelor drepte (</w:t>
-      </w:r>
-      <w:r>
-        <w:rPr>
-          <w:rFonts w:ascii="Consolas" w:cs="Consolas" w:eastAsia="Consolas" w:hAnsi="Consolas"/>
-          <w:sz w:val="19"/>
-          <w:szCs w:val="19"/>
-        </w:rPr>
-        <w:t xml:space="preserve">4%%C12</w:t>
-      </w:r>
-      <w:r>
-        <w:t xml:space="preserve">, </w:t>
-      </w:r>
-      <w:r>
-        <w:rPr>
-          <w:rFonts w:ascii="Consolas" w:cs="Consolas" w:eastAsia="Consolas" w:hAnsi="Consolas"/>
-          <w:sz w:val="19"/>
-          <w:szCs w:val="19"/>
-        </w:rPr>
-        <w:t xml:space="preserve">L=12.00m</w:t>
-      </w:r>
-      <w:r>
-        <w:t xml:space="preserve">, </w:t>
-      </w:r>
-      <w:r>
-        <w:rPr>
-          <w:rFonts w:ascii="Consolas" w:cs="Consolas" w:eastAsia="Consolas" w:hAnsi="Consolas"/>
-          <w:sz w:val="19"/>
-          <w:szCs w:val="19"/>
-        </w:rPr>
-        <w:t xml:space="preserve">xxx buc.</w:t>
-      </w:r>
-      <w:r>
-        <w:t xml:space="preserve"> - se completeaza de mana).</w:t>
-      </w:r>
+        <w:t>La sfarsitul randului, cate un detaliu pentru fiecare tip de centura de pe plan (dupa numele C..): sectiunea la 1:20 (cu placa din grupul de cofraj al centurii), barele, etrierul in sectiune, cotele de nivel, etrierul desfasurat (laturi = centura - 5 cm, etr %%C8/15, L= field) cu numarul de bucati, si dedesubt grupul barelor drepte (4%%C12, L=12.00m, bucatile calculate - de verificat).</w:t>
+      </w:r>
+      <w:r>
+        <w:rPr>
+          <w:rFonts w:ascii="Consolas" w:cs="Consolas" w:eastAsia="Consolas" w:hAnsi="Consolas"/>
+          <w:sz w:val="19"/>
+          <w:szCs w:val="19"/>
+        </w:rPr>
+      </w:r>
+      <w:r/>
+      <w:r>
+        <w:rPr>
+          <w:rFonts w:ascii="Consolas" w:cs="Consolas" w:eastAsia="Consolas" w:hAnsi="Consolas"/>
+          <w:sz w:val="19"/>
+          <w:szCs w:val="19"/>
+        </w:rPr>
+      </w:r>
+      <w:r/>
+      <w:r>
+        <w:rPr>
+          <w:rFonts w:ascii="Consolas" w:cs="Consolas" w:eastAsia="Consolas" w:hAnsi="Consolas"/>
+          <w:sz w:val="19"/>
+          <w:szCs w:val="19"/>
+        </w:rPr>
+      </w:r>
+      <w:r/>
+      <w:r>
+        <w:rPr>
+          <w:rFonts w:ascii="Consolas" w:cs="Consolas" w:eastAsia="Consolas" w:hAnsi="Consolas"/>
+          <w:sz w:val="19"/>
+          <w:szCs w:val="19"/>
+        </w:rPr>
+      </w:r>
+      <w:r/>
     </w:p>
     <w:p>
       <w:pPr>
@@ -2608,7 +2596,7 @@
         <w:spacing w:after="60" w:line="276"/>
       </w:pPr>
       <w:r>
-        <w:t xml:space="preserve">barele: doar o estimare in linia de comanda (lungimea fasiilor, intrarile peste reazeme, innadiri de 50 de diametre, la 12 m).</w:t>
+        <w:t>barele: lungimea centurilor - la zidurile exterioare conturul exterior al casei, la cele interioare una din cele doua linii - x numarul de bare, / 12 m, rotunjit in sus, apoi x 1.25 pentru petreceri si coltare, rotunjit (de exemplu 62 m x 4 = 248 m / 12 = 20.67 -&gt; 21 x 1.25 = 26.25 -&gt; 26 buc.); numarul se scrie in grupul barelor drepte - de verificat.</w:t>
       </w:r>
     </w:p>
     <w:p>

</xml_diff>